<commit_message>
v0.13.2 - fix legacy "True Zero" leftovers in bundled docs + staple .app
Pre-beta deep-dive found two issues a first beta tester would have hit:

1. All three Loadscope-renamed docx files (App Overview, Quick Start,
   How to Send Out Updates) still said "True Zero" inside the document
   content. The v0.13.0 rename renamed the FILES but the in-place XML
   content edit either missed or got reverted. 34 references in total,
   all replaced with "Loadscope" via Python zipfile XML rewrite.

2. Build script stapled the notarization ticket onto the .dmg but not
   onto the .app itself. The .zip (which the auto-update path uses)
   packages the .app directly, so its .app had no offline ticket.
   Gatekeeper would have fallen back to online verification, which
   fails on first launch when the user has no internet. Now stapling
   both .dmg and .app.

No code changes - purely user-facing assets + build pipeline polish.

Co-Authored-By: Claude Opus 4.7 (1M context) <noreply@anthropic.com>
</commit_message>
<xml_diff>
--- a/Loadscope — App Overview.docx
+++ b/Loadscope — App Overview.docx
@@ -14,7 +14,7 @@
           <w:color w:val="000000"/>
           <w:sz w:val="40"/>
         </w:rPr>
-        <w:t>True Zero — App Overview</w:t>
+        <w:t>Loadscope — App Overview</w:t>
       </w:r>
     </w:p>
     <w:p>
@@ -40,7 +40,7 @@
     </w:p>
     <w:p>
       <w:r>
-        <w:t xml:space="preserve">True Zero is an app for </w:t>
+        <w:t xml:space="preserve">Loadscope is an app for </w:t>
       </w:r>
       <w:r>
         <w:t xml:space="preserve">precision rifle </w:t>
@@ -88,7 +88,7 @@
         <w:t xml:space="preserve">After your range session, </w:t>
       </w:r>
       <w:r>
-        <w:t xml:space="preserve">True Zero reads the data from two devices a shooter already uses — a Garmin </w:t>
+        <w:t xml:space="preserve">Loadscope reads the data from two devices a shooter already uses — a Garmin </w:t>
       </w:r>
       <w:proofErr w:type="spellStart"/>
       <w:r>
@@ -119,7 +119,7 @@
         <w:t>(More devices can be added )</w:t>
       </w:r>
       <w:r>
-        <w:t xml:space="preserve">— and pulls everything into one organized workbook. The shooter just drags the data files onto the True Zero </w:t>
+        <w:t xml:space="preserve">— and pulls everything into one organized workbook. The shooter just drags the data files onto the Loadscope </w:t>
       </w:r>
       <w:r>
         <w:t>App icon</w:t>
@@ -151,7 +151,7 @@
     </w:p>
     <w:p>
       <w:r>
-        <w:t xml:space="preserve">True Zero uses a four-factor weighted scoring system to rank powder loads and seating depths. For powder ladder testing, True Zero evaluates each load as the center of a three-charge "window" — plus the load just below it and the load just above. So Load 2 is graded inside the Load 1–Load 2–Load 3 group, Load 3 inside the Load 2–Load 3–Load 4 group, and so on, sliding one step at a time. The goal is to find a velocity node: a spot in the ladder where small changes in powder </w:t>
+        <w:t xml:space="preserve">Loadscope uses a four-factor weighted scoring system to rank powder loads and seating depths. For powder ladder testing, Loadscope evaluates each load as the center of a three-charge "window" — plus the load just below it and the load just above. So Load 2 is graded inside the Load 1–Load 2–Load 3 group, Load 3 inside the Load 2–Load 3–Load 4 group, and so on, sliding one step at a time. The goal is to find a velocity node: a spot in the ladder where small changes in powder </w:t>
       </w:r>
       <w:r>
         <w:t>charge have little velocity change</w:t>
@@ -200,7 +200,7 @@
     </w:p>
     <w:p>
       <w:r>
-        <w:t xml:space="preserve">The True Zero workbook contains </w:t>
+        <w:t xml:space="preserve">The Loadscope workbook contains </w:t>
       </w:r>
       <w:r>
         <w:rPr>

</xml_diff>